<commit_message>
Flujo completo de olvide-mi-contrasena,envio del codigo de verificacion por email via JavaMail/SMTP, implementación de nueva libreria javax.mail.jar.
</commit_message>
<xml_diff>
--- a/Informe_Laboratorio_LB.docx
+++ b/Informe_Laboratorio_LB.docx
@@ -58,7 +58,7 @@
           <w:sz w:val="20"/>
           <w:szCs w:val="20"/>
         </w:rPr>
-        <w:t xml:space="preserve">Autora: Agustina Borora    ·    Fecha: 2 de septiembre de 2026</w:t>
+        <w:t xml:space="preserve">Autora: Agustina Borora    ·    Fecha: 2 de septiembre de 2026    ·    Actualizado: 6 de septiembre de 2026</w:t>
       </w:r>
     </w:p>
     <w:p>
@@ -2500,6 +2500,869 @@
           <w:szCs w:val="21"/>
         </w:rPr>
         <w:t xml:space="preserve">El proyecto cuenta con una interfaz gráfica extensa y prolija (FlatLaf, componentes redondeados propios, tablas estilizadas), pero al momento de esta revisión la lógica de negocio y persistencia solo estaba resuelta para el login. En esta sesión se sentó el primer precedente de una capa Modelo/DAO reutilizable, aplicada al módulo de Pacientes, que puede replicarse módulo por módulo para acercar el proyecto a una arquitectura ordenada sin apartarse del estilo simple que ya se venía usando.</w:t>
+      </w:r>
+    </w:p>
+    <w:p>
+      <w:pPr>
+        <w:pStyle w:val="Heading1"/>
+        <w:pBdr>
+          <w:bottom w:val="single" w:color="2E7D4F" w:sz="8" w:space="4"/>
+        </w:pBdr>
+        <w:spacing w:after="160" w:before="360"/>
+      </w:pPr>
+      <w:r>
+        <w:rPr>
+          <w:rFonts w:ascii="Calibri" w:cs="Calibri" w:eastAsia="Calibri" w:hAnsi="Calibri"/>
+          <w:b/>
+          <w:bCs/>
+          <w:color w:val="1F4E3D"/>
+          <w:sz w:val="30"/>
+          <w:szCs w:val="30"/>
+        </w:rPr>
+        <w:t xml:space="preserve">9. Actualización — Usabilidad y recuperación de contraseña por email</w:t>
+      </w:r>
+    </w:p>
+    <w:p>
+      <w:pPr>
+        <w:spacing w:after="160" w:line="288"/>
+      </w:pPr>
+      <w:r>
+        <w:rPr>
+          <w:rFonts w:ascii="Calibri" w:cs="Calibri" w:eastAsia="Calibri" w:hAnsi="Calibri"/>
+          <w:sz w:val="21"/>
+          <w:szCs w:val="21"/>
+        </w:rPr>
+        <w:t xml:space="preserve">En una sesión posterior a la versión anterior de este informe (2 de septiembre de 2026) se trabajó sobre tres frentes: una corrección de comportamiento en la ventana principal, una pasada de documentación técnica sobre el código ya existente, y la implementación completa de un flujo de recuperación de contraseña por email. Este último punto resuelve, además, uno de los pendientes señalados explícitamente en la sección 7 de este informe (incorporar hash de contraseñas).</w:t>
+      </w:r>
+    </w:p>
+    <w:p>
+      <w:pPr>
+        <w:pStyle w:val="Heading2"/>
+        <w:spacing w:after="120" w:before="220"/>
+      </w:pPr>
+      <w:r>
+        <w:rPr>
+          <w:rFonts w:ascii="Calibri" w:cs="Calibri" w:eastAsia="Calibri" w:hAnsi="Calibri"/>
+          <w:b/>
+          <w:bCs/>
+          <w:color w:val="2E7D4F"/>
+          <w:sz w:val="24"/>
+          <w:szCs w:val="24"/>
+        </w:rPr>
+        <w:t xml:space="preserve">9.1 Corrección de ajuste de pantalla (Principal.java)</w:t>
+      </w:r>
+    </w:p>
+    <w:p>
+      <w:pPr>
+        <w:spacing w:after="160" w:line="288"/>
+      </w:pPr>
+      <w:r>
+        <w:rPr>
+          <w:rFonts w:ascii="Calibri" w:cs="Calibri" w:eastAsia="Calibri" w:hAnsi="Calibri"/>
+          <w:sz w:val="21"/>
+          <w:szCs w:val="21"/>
+        </w:rPr>
+        <w:t xml:space="preserve">Se detectó que la ventana principal (formulariosPrincipales.Principal) no se ajustaba correctamente a la resolución de pantalla del equipo, quedando más grande que el área visible y obligando a moverla para ver el resto de la interfaz. El cálculo de límites usables mediante GraphicsEnvironment.getMaximumWindowBounds() no resultaba confiable en la configuración de pantalla probada. Se reemplazó ese cálculo por el mecanismo nativo de maximizado de la ventana (Frame.MAXIMIZED_BOTH), fijando además el límite máximo con setMaximizedBounds() para que la barra de tareas de Windows quede siempre visible.</w:t>
+      </w:r>
+    </w:p>
+    <w:p>
+      <w:pPr>
+        <w:pStyle w:val="Heading2"/>
+        <w:spacing w:after="120" w:before="220"/>
+      </w:pPr>
+      <w:r>
+        <w:rPr>
+          <w:rFonts w:ascii="Calibri" w:cs="Calibri" w:eastAsia="Calibri" w:hAnsi="Calibri"/>
+          <w:b/>
+          <w:bCs/>
+          <w:color w:val="2E7D4F"/>
+          <w:sz w:val="24"/>
+          <w:szCs w:val="24"/>
+        </w:rPr>
+        <w:t xml:space="preserve">9.2 Documentación técnica del código fuente (Javadoc)</w:t>
+      </w:r>
+    </w:p>
+    <w:p>
+      <w:pPr>
+        <w:spacing w:after="160" w:line="288"/>
+      </w:pPr>
+      <w:r>
+        <w:rPr>
+          <w:rFonts w:ascii="Calibri" w:cs="Calibri" w:eastAsia="Calibri" w:hAnsi="Calibri"/>
+          <w:sz w:val="21"/>
+          <w:szCs w:val="21"/>
+        </w:rPr>
+        <w:t xml:space="preserve">Se incorporó documentación Javadoc a las clases de los paquetes formulariosPrincipales, registros, pacientes, escritorio, nuevoAnalisis, registrarResultados, panels, menu, acciones y conexiones, que hasta el momento solo contaban con los comentarios genéricos que agrega el editor de NetBeans. La documentación agregada describe el propósito de cada clase y método sin modificar la lógica existente, y respeta las secciones generadas automáticamente por el editor visual (initComponents(), "Variables declaration"), que el propio NetBeans advierte no editar a mano.</w:t>
+      </w:r>
+    </w:p>
+    <w:p>
+      <w:pPr>
+        <w:pStyle w:val="Heading2"/>
+        <w:spacing w:after="120" w:before="220"/>
+      </w:pPr>
+      <w:r>
+        <w:rPr>
+          <w:rFonts w:ascii="Calibri" w:cs="Calibri" w:eastAsia="Calibri" w:hAnsi="Calibri"/>
+          <w:b/>
+          <w:bCs/>
+          <w:color w:val="2E7D4F"/>
+          <w:sz w:val="24"/>
+          <w:szCs w:val="24"/>
+        </w:rPr>
+        <w:t xml:space="preserve">9.3 Recuperación de contraseña por email</w:t>
+      </w:r>
+    </w:p>
+    <w:p>
+      <w:pPr>
+        <w:spacing w:after="160" w:line="288"/>
+      </w:pPr>
+      <w:r>
+        <w:rPr>
+          <w:rFonts w:ascii="Calibri" w:cs="Calibri" w:eastAsia="Calibri" w:hAnsi="Calibri"/>
+          <w:sz w:val="21"/>
+          <w:szCs w:val="21"/>
+        </w:rPr>
+        <w:t xml:space="preserve">Se implementó el flujo completo de recuperación de contraseña a partir de dos pantallas que ya existían en el paquete vistas (CambiarContraseña, TokenDeConfirmacion) pero todavía no tenían lógica asociada: el comentario de clase de ambas las describía como "maquetado visual únicamente". El flujo consta de tres pasos — pedir el email de la cuenta, verificar un código de 6 dígitos enviado por correo, y elegir una contraseña nueva — coordinados por una ventana nueva (RecuperarContrasenaFrame) que se abre desde el link "¿Olvidaste tu contraseña?" del Login.</w:t>
+      </w:r>
+    </w:p>
+    <w:tbl>
+      <w:tblPr>
+        <w:tblW w:type="dxa" w:w="9400"/>
+        <w:tblBorders>
+          <w:top w:val="single" w:color="auto" w:sz="4"/>
+          <w:left w:val="single" w:color="auto" w:sz="4"/>
+          <w:bottom w:val="single" w:color="auto" w:sz="4"/>
+          <w:right w:val="single" w:color="auto" w:sz="4"/>
+          <w:insideH w:val="single" w:color="auto" w:sz="4"/>
+          <w:insideV w:val="single" w:color="auto" w:sz="4"/>
+        </w:tblBorders>
+      </w:tblPr>
+      <w:tblGrid>
+        <w:gridCol w:w="1500"/>
+        <w:gridCol w:w="4200"/>
+        <w:gridCol w:w="3700"/>
+      </w:tblGrid>
+      <w:tr>
+        <w:trPr>
+          <w:tblHeader/>
+        </w:trPr>
+        <w:tc>
+          <w:tcPr>
+            <w:tcW w:type="dxa" w:w="1500"/>
+            <w:shd w:fill="2E7D4F" w:val="clear"/>
+            <w:tcMar>
+              <w:top w:type="dxa" w:w="80"/>
+              <w:left w:type="dxa" w:w="120"/>
+              <w:bottom w:type="dxa" w:w="80"/>
+              <w:right w:type="dxa" w:w="120"/>
+            </w:tcMar>
+            <w:vAlign w:val="center"/>
+          </w:tcPr>
+          <w:p>
+            <w:pPr>
+              <w:jc w:val="left"/>
+            </w:pPr>
+            <w:r>
+              <w:rPr>
+                <w:rFonts w:ascii="Calibri" w:cs="Calibri" w:eastAsia="Calibri" w:hAnsi="Calibri"/>
+                <w:b/>
+                <w:bCs/>
+                <w:color w:val="FFFFFF"/>
+                <w:sz w:val="19"/>
+                <w:szCs w:val="19"/>
+              </w:rPr>
+              <w:t xml:space="preserve">Paquete</w:t>
+            </w:r>
+          </w:p>
+        </w:tc>
+        <w:tc>
+          <w:tcPr>
+            <w:tcW w:type="dxa" w:w="4200"/>
+            <w:shd w:fill="2E7D4F" w:val="clear"/>
+            <w:tcMar>
+              <w:top w:type="dxa" w:w="80"/>
+              <w:left w:type="dxa" w:w="120"/>
+              <w:bottom w:type="dxa" w:w="80"/>
+              <w:right w:type="dxa" w:w="120"/>
+            </w:tcMar>
+            <w:vAlign w:val="center"/>
+          </w:tcPr>
+          <w:p>
+            <w:pPr>
+              <w:jc w:val="left"/>
+            </w:pPr>
+            <w:r>
+              <w:rPr>
+                <w:rFonts w:ascii="Calibri" w:cs="Calibri" w:eastAsia="Calibri" w:hAnsi="Calibri"/>
+                <w:b/>
+                <w:bCs/>
+                <w:color w:val="FFFFFF"/>
+                <w:sz w:val="19"/>
+                <w:szCs w:val="19"/>
+              </w:rPr>
+              <w:t xml:space="preserve">Clases principales</w:t>
+            </w:r>
+          </w:p>
+        </w:tc>
+        <w:tc>
+          <w:tcPr>
+            <w:tcW w:type="dxa" w:w="3700"/>
+            <w:shd w:fill="2E7D4F" w:val="clear"/>
+            <w:tcMar>
+              <w:top w:type="dxa" w:w="80"/>
+              <w:left w:type="dxa" w:w="120"/>
+              <w:bottom w:type="dxa" w:w="80"/>
+              <w:right w:type="dxa" w:w="120"/>
+            </w:tcMar>
+            <w:vAlign w:val="center"/>
+          </w:tcPr>
+          <w:p>
+            <w:pPr>
+              <w:jc w:val="left"/>
+            </w:pPr>
+            <w:r>
+              <w:rPr>
+                <w:rFonts w:ascii="Calibri" w:cs="Calibri" w:eastAsia="Calibri" w:hAnsi="Calibri"/>
+                <w:b/>
+                <w:bCs/>
+                <w:color w:val="FFFFFF"/>
+                <w:sz w:val="19"/>
+                <w:szCs w:val="19"/>
+              </w:rPr>
+              <w:t xml:space="preserve">Rol</w:t>
+            </w:r>
+          </w:p>
+        </w:tc>
+      </w:tr>
+      <w:tr>
+        <w:tc>
+          <w:tcPr>
+            <w:tcW w:type="dxa" w:w="1500"/>
+            <w:shd w:fill="FFFFFF" w:val="clear"/>
+            <w:tcMar>
+              <w:top w:type="dxa" w:w="80"/>
+              <w:left w:type="dxa" w:w="120"/>
+              <w:bottom w:type="dxa" w:w="80"/>
+              <w:right w:type="dxa" w:w="120"/>
+            </w:tcMar>
+            <w:vAlign w:val="center"/>
+          </w:tcPr>
+          <w:p>
+            <w:pPr>
+              <w:jc w:val="left"/>
+            </w:pPr>
+            <w:r>
+              <w:rPr>
+                <w:rFonts w:ascii="Calibri" w:cs="Calibri" w:eastAsia="Calibri" w:hAnsi="Calibri"/>
+                <w:color w:val="000000"/>
+                <w:sz w:val="20"/>
+                <w:szCs w:val="20"/>
+              </w:rPr>
+              <w:t xml:space="preserve">vistas</w:t>
+            </w:r>
+          </w:p>
+        </w:tc>
+        <w:tc>
+          <w:tcPr>
+            <w:tcW w:type="dxa" w:w="4200"/>
+            <w:shd w:fill="FFFFFF" w:val="clear"/>
+            <w:tcMar>
+              <w:top w:type="dxa" w:w="80"/>
+              <w:left w:type="dxa" w:w="120"/>
+              <w:bottom w:type="dxa" w:w="80"/>
+              <w:right w:type="dxa" w:w="120"/>
+            </w:tcMar>
+            <w:vAlign w:val="center"/>
+          </w:tcPr>
+          <w:p>
+            <w:pPr>
+              <w:jc w:val="left"/>
+            </w:pPr>
+            <w:r>
+              <w:rPr>
+                <w:rFonts w:ascii="Calibri" w:cs="Calibri" w:eastAsia="Calibri" w:hAnsi="Calibri"/>
+                <w:color w:val="000000"/>
+                <w:sz w:val="20"/>
+                <w:szCs w:val="20"/>
+              </w:rPr>
+              <w:t xml:space="preserve">PedirEmailPanel y RecuperarContrasenaFrame (nuevas); CambiarContraseña y TokenDeConfirmacion (ya existían, se conectaron)</w:t>
+            </w:r>
+          </w:p>
+        </w:tc>
+        <w:tc>
+          <w:tcPr>
+            <w:tcW w:type="dxa" w:w="3700"/>
+            <w:shd w:fill="FFFFFF" w:val="clear"/>
+            <w:tcMar>
+              <w:top w:type="dxa" w:w="80"/>
+              <w:left w:type="dxa" w:w="120"/>
+              <w:bottom w:type="dxa" w:w="80"/>
+              <w:right w:type="dxa" w:w="120"/>
+            </w:tcMar>
+            <w:vAlign w:val="center"/>
+          </w:tcPr>
+          <w:p>
+            <w:pPr>
+              <w:jc w:val="left"/>
+            </w:pPr>
+            <w:r>
+              <w:rPr>
+                <w:rFonts w:ascii="Calibri" w:cs="Calibri" w:eastAsia="Calibri" w:hAnsi="Calibri"/>
+                <w:color w:val="000000"/>
+                <w:sz w:val="20"/>
+                <w:szCs w:val="20"/>
+              </w:rPr>
+              <w:t xml:space="preserve">Vista: piden los datos al usuario y delegan cada evento a controlador.PasswordController mediante interfaces de escucha, sin acceder ellas mismas a la base</w:t>
+            </w:r>
+          </w:p>
+        </w:tc>
+      </w:tr>
+      <w:tr>
+        <w:tc>
+          <w:tcPr>
+            <w:tcW w:type="dxa" w:w="1500"/>
+            <w:shd w:fill="F7F9F8" w:val="clear"/>
+            <w:tcMar>
+              <w:top w:type="dxa" w:w="80"/>
+              <w:left w:type="dxa" w:w="120"/>
+              <w:bottom w:type="dxa" w:w="80"/>
+              <w:right w:type="dxa" w:w="120"/>
+            </w:tcMar>
+            <w:vAlign w:val="center"/>
+          </w:tcPr>
+          <w:p>
+            <w:pPr>
+              <w:jc w:val="left"/>
+            </w:pPr>
+            <w:r>
+              <w:rPr>
+                <w:rFonts w:ascii="Calibri" w:cs="Calibri" w:eastAsia="Calibri" w:hAnsi="Calibri"/>
+                <w:color w:val="000000"/>
+                <w:sz w:val="20"/>
+                <w:szCs w:val="20"/>
+              </w:rPr>
+              <w:t xml:space="preserve">controlador</w:t>
+            </w:r>
+          </w:p>
+        </w:tc>
+        <w:tc>
+          <w:tcPr>
+            <w:tcW w:type="dxa" w:w="4200"/>
+            <w:shd w:fill="F7F9F8" w:val="clear"/>
+            <w:tcMar>
+              <w:top w:type="dxa" w:w="80"/>
+              <w:left w:type="dxa" w:w="120"/>
+              <w:bottom w:type="dxa" w:w="80"/>
+              <w:right w:type="dxa" w:w="120"/>
+            </w:tcMar>
+            <w:vAlign w:val="center"/>
+          </w:tcPr>
+          <w:p>
+            <w:pPr>
+              <w:jc w:val="left"/>
+            </w:pPr>
+            <w:r>
+              <w:rPr>
+                <w:rFonts w:ascii="Calibri" w:cs="Calibri" w:eastAsia="Calibri" w:hAnsi="Calibri"/>
+                <w:color w:val="000000"/>
+                <w:sz w:val="20"/>
+                <w:szCs w:val="20"/>
+              </w:rPr>
+              <w:t xml:space="preserve">PasswordController, PasswordHasher (nuevas)</w:t>
+            </w:r>
+          </w:p>
+        </w:tc>
+        <w:tc>
+          <w:tcPr>
+            <w:tcW w:type="dxa" w:w="3700"/>
+            <w:shd w:fill="F7F9F8" w:val="clear"/>
+            <w:tcMar>
+              <w:top w:type="dxa" w:w="80"/>
+              <w:left w:type="dxa" w:w="120"/>
+              <w:bottom w:type="dxa" w:w="80"/>
+              <w:right w:type="dxa" w:w="120"/>
+            </w:tcMar>
+            <w:vAlign w:val="center"/>
+          </w:tcPr>
+          <w:p>
+            <w:pPr>
+              <w:jc w:val="left"/>
+            </w:pPr>
+            <w:r>
+              <w:rPr>
+                <w:rFonts w:ascii="Calibri" w:cs="Calibri" w:eastAsia="Calibri" w:hAnsi="Calibri"/>
+                <w:color w:val="000000"/>
+                <w:sz w:val="20"/>
+                <w:szCs w:val="20"/>
+              </w:rPr>
+              <w:t xml:space="preserve">Controlador: orquesta el caso de uso (generar código, verificarlo, cambiar la contraseña) y encapsula el algoritmo de hashing</w:t>
+            </w:r>
+          </w:p>
+        </w:tc>
+      </w:tr>
+      <w:tr>
+        <w:tc>
+          <w:tcPr>
+            <w:tcW w:type="dxa" w:w="1500"/>
+            <w:shd w:fill="FFFFFF" w:val="clear"/>
+            <w:tcMar>
+              <w:top w:type="dxa" w:w="80"/>
+              <w:left w:type="dxa" w:w="120"/>
+              <w:bottom w:type="dxa" w:w="80"/>
+              <w:right w:type="dxa" w:w="120"/>
+            </w:tcMar>
+            <w:vAlign w:val="center"/>
+          </w:tcPr>
+          <w:p>
+            <w:pPr>
+              <w:jc w:val="left"/>
+            </w:pPr>
+            <w:r>
+              <w:rPr>
+                <w:rFonts w:ascii="Calibri" w:cs="Calibri" w:eastAsia="Calibri" w:hAnsi="Calibri"/>
+                <w:color w:val="000000"/>
+                <w:sz w:val="20"/>
+                <w:szCs w:val="20"/>
+              </w:rPr>
+              <w:t xml:space="preserve">dao</w:t>
+            </w:r>
+          </w:p>
+        </w:tc>
+        <w:tc>
+          <w:tcPr>
+            <w:tcW w:type="dxa" w:w="4200"/>
+            <w:shd w:fill="FFFFFF" w:val="clear"/>
+            <w:tcMar>
+              <w:top w:type="dxa" w:w="80"/>
+              <w:left w:type="dxa" w:w="120"/>
+              <w:bottom w:type="dxa" w:w="80"/>
+              <w:right w:type="dxa" w:w="120"/>
+            </w:tcMar>
+            <w:vAlign w:val="center"/>
+          </w:tcPr>
+          <w:p>
+            <w:pPr>
+              <w:jc w:val="left"/>
+            </w:pPr>
+            <w:r>
+              <w:rPr>
+                <w:rFonts w:ascii="Calibri" w:cs="Calibri" w:eastAsia="Calibri" w:hAnsi="Calibri"/>
+                <w:color w:val="000000"/>
+                <w:sz w:val="20"/>
+                <w:szCs w:val="20"/>
+              </w:rPr>
+              <w:t xml:space="preserve">PasswordResetDAO (nueva)</w:t>
+            </w:r>
+          </w:p>
+        </w:tc>
+        <w:tc>
+          <w:tcPr>
+            <w:tcW w:type="dxa" w:w="3700"/>
+            <w:shd w:fill="FFFFFF" w:val="clear"/>
+            <w:tcMar>
+              <w:top w:type="dxa" w:w="80"/>
+              <w:left w:type="dxa" w:w="120"/>
+              <w:bottom w:type="dxa" w:w="80"/>
+              <w:right w:type="dxa" w:w="120"/>
+            </w:tcMar>
+            <w:vAlign w:val="center"/>
+          </w:tcPr>
+          <w:p>
+            <w:pPr>
+              <w:jc w:val="left"/>
+            </w:pPr>
+            <w:r>
+              <w:rPr>
+                <w:rFonts w:ascii="Calibri" w:cs="Calibri" w:eastAsia="Calibri" w:hAnsi="Calibri"/>
+                <w:color w:val="000000"/>
+                <w:sz w:val="20"/>
+                <w:szCs w:val="20"/>
+              </w:rPr>
+              <w:t xml:space="preserve">Acceso a datos de la nueva tabla password_reset_tokens</w:t>
+            </w:r>
+          </w:p>
+        </w:tc>
+      </w:tr>
+      <w:tr>
+        <w:tc>
+          <w:tcPr>
+            <w:tcW w:type="dxa" w:w="1500"/>
+            <w:shd w:fill="F7F9F8" w:val="clear"/>
+            <w:tcMar>
+              <w:top w:type="dxa" w:w="80"/>
+              <w:left w:type="dxa" w:w="120"/>
+              <w:bottom w:type="dxa" w:w="80"/>
+              <w:right w:type="dxa" w:w="120"/>
+            </w:tcMar>
+            <w:vAlign w:val="center"/>
+          </w:tcPr>
+          <w:p>
+            <w:pPr>
+              <w:jc w:val="left"/>
+            </w:pPr>
+            <w:r>
+              <w:rPr>
+                <w:rFonts w:ascii="Calibri" w:cs="Calibri" w:eastAsia="Calibri" w:hAnsi="Calibri"/>
+                <w:color w:val="000000"/>
+                <w:sz w:val="20"/>
+                <w:szCs w:val="20"/>
+              </w:rPr>
+              <w:t xml:space="preserve">conexiones</w:t>
+            </w:r>
+          </w:p>
+        </w:tc>
+        <w:tc>
+          <w:tcPr>
+            <w:tcW w:type="dxa" w:w="4200"/>
+            <w:shd w:fill="F7F9F8" w:val="clear"/>
+            <w:tcMar>
+              <w:top w:type="dxa" w:w="80"/>
+              <w:left w:type="dxa" w:w="120"/>
+              <w:bottom w:type="dxa" w:w="80"/>
+              <w:right w:type="dxa" w:w="120"/>
+            </w:tcMar>
+            <w:vAlign w:val="center"/>
+          </w:tcPr>
+          <w:p>
+            <w:pPr>
+              <w:jc w:val="left"/>
+            </w:pPr>
+            <w:r>
+              <w:rPr>
+                <w:rFonts w:ascii="Calibri" w:cs="Calibri" w:eastAsia="Calibri" w:hAnsi="Calibri"/>
+                <w:color w:val="000000"/>
+                <w:sz w:val="20"/>
+                <w:szCs w:val="20"/>
+              </w:rPr>
+              <w:t xml:space="preserve">Usuario (extendida), EmailService (nueva)</w:t>
+            </w:r>
+          </w:p>
+        </w:tc>
+        <w:tc>
+          <w:tcPr>
+            <w:tcW w:type="dxa" w:w="3700"/>
+            <w:shd w:fill="F7F9F8" w:val="clear"/>
+            <w:tcMar>
+              <w:top w:type="dxa" w:w="80"/>
+              <w:left w:type="dxa" w:w="120"/>
+              <w:bottom w:type="dxa" w:w="80"/>
+              <w:right w:type="dxa" w:w="120"/>
+            </w:tcMar>
+            <w:vAlign w:val="center"/>
+          </w:tcPr>
+          <w:p>
+            <w:pPr>
+              <w:jc w:val="left"/>
+            </w:pPr>
+            <w:r>
+              <w:rPr>
+                <w:rFonts w:ascii="Calibri" w:cs="Calibri" w:eastAsia="Calibri" w:hAnsi="Calibri"/>
+                <w:color w:val="000000"/>
+                <w:sz w:val="20"/>
+                <w:szCs w:val="20"/>
+              </w:rPr>
+              <w:t xml:space="preserve">Modelo/DAO de usuarios (ahora con verificación por hash) y envío de emails por SMTP</w:t>
+            </w:r>
+          </w:p>
+        </w:tc>
+      </w:tr>
+    </w:tbl>
+    <w:p>
+      <w:pPr>
+        <w:spacing w:after="120"/>
+      </w:pPr>
+    </w:p>
+    <w:p>
+      <w:pPr>
+        <w:spacing w:after="160" w:line="288"/>
+      </w:pPr>
+      <w:r>
+        <w:rPr>
+          <w:rFonts w:ascii="Calibri" w:cs="Calibri" w:eastAsia="Calibri" w:hAnsi="Calibri"/>
+          <w:b/>
+          <w:bCs/>
+          <w:color w:val="2E7D4F"/>
+          <w:sz w:val="21"/>
+          <w:szCs w:val="21"/>
+        </w:rPr>
+        <w:t xml:space="preserve">Seguridad: </w:t>
+      </w:r>
+      <w:r>
+        <w:rPr>
+          <w:rFonts w:ascii="Calibri" w:cs="Calibri" w:eastAsia="Calibri" w:hAnsi="Calibri"/>
+          <w:sz w:val="21"/>
+          <w:szCs w:val="21"/>
+        </w:rPr>
+        <w:t xml:space="preserve">Esta implementación resuelve, de paso, uno de los hallazgos señalados en la sección 5 de este informe: Usuario.ingresar() comparaba la contraseña en texto plano por igualdad SQL. En lugar de jBCrypt (la librería sugerida originalmente), se optó por PBKDF2 con HMAC-SHA256 (javax.crypto.SecretKeyFactory), ya incluido en el JDK, para no sumar una dependencia externa más. El valor guardado en password_usuario pasa a tener el formato iteraciones:saltBase64:hashBase64. Para no requerir una migración de datos aparte, Usuario.ingresar() reconoce automáticamente las contraseñas que todavía estén en texto plano, valida contra ese valor y, si coincide, la re-guarda ya hasheada en el mismo momento — una migración transparente, sin script ni tiempo de inactividad.</w:t>
+      </w:r>
+    </w:p>
+    <w:p>
+      <w:pPr>
+        <w:spacing w:after="160" w:line="288"/>
+      </w:pPr>
+      <w:r>
+        <w:rPr>
+          <w:rFonts w:ascii="Calibri" w:cs="Calibri" w:eastAsia="Calibri" w:hAnsi="Calibri"/>
+          <w:b/>
+          <w:bCs/>
+          <w:color w:val="2E7D4F"/>
+          <w:sz w:val="21"/>
+          <w:szCs w:val="21"/>
+        </w:rPr>
+        <w:t xml:space="preserve">Base de datos: </w:t>
+      </w:r>
+      <w:r>
+        <w:rPr>
+          <w:rFonts w:ascii="Calibri" w:cs="Calibri" w:eastAsia="Calibri" w:hAnsi="Calibri"/>
+          <w:sz w:val="21"/>
+          <w:szCs w:val="21"/>
+        </w:rPr>
+        <w:t xml:space="preserve">Se agregó la migración sql/migracion_06_password_reset.sql, que amplía usuarios.password_usuario a VARCHAR(255) (para que entre el hash) y crea la tabla password_reset_tokens (id_token, id_usuario, codigo_hash, fecha_creacion, fecha_expiracion, usado) con clave foránea a usuarios. Cada código de verificación se guarda también hasheado — nunca en texto plano — y vence a los 15 minutos.</w:t>
+      </w:r>
+    </w:p>
+    <w:p>
+      <w:pPr>
+        <w:spacing w:after="160" w:line="288"/>
+      </w:pPr>
+      <w:r>
+        <w:rPr>
+          <w:rFonts w:ascii="Calibri" w:cs="Calibri" w:eastAsia="Calibri" w:hAnsi="Calibri"/>
+          <w:b/>
+          <w:bCs/>
+          <w:color w:val="2E7D4F"/>
+          <w:sz w:val="21"/>
+          <w:szCs w:val="21"/>
+        </w:rPr>
+        <w:t xml:space="preserve">Envío de email: </w:t>
+      </w:r>
+      <w:r>
+        <w:rPr>
+          <w:rFonts w:ascii="Calibri" w:cs="Calibri" w:eastAsia="Calibri" w:hAnsi="Calibri"/>
+          <w:sz w:val="21"/>
+          <w:szCs w:val="21"/>
+        </w:rPr>
+        <w:t xml:space="preserve">El envío de emails se resolvió con JavaMail (javax.mail) por SMTP. Las credenciales de conexión (host, usuario, contraseña de aplicación de Gmail) se leen en tiempo de ejecución desde un archivo email.properties externo al código fuente, excluido del repositorio Git mediante .gitignore — el mismo criterio ya aplicado a Conexion.java para no versionar credenciales — e incluye email.properties.example como plantilla.</w:t>
+      </w:r>
+    </w:p>
+    <w:p>
+      <w:pPr>
+        <w:spacing w:after="160" w:line="288"/>
+      </w:pPr>
+      <w:r>
+        <w:rPr>
+          <w:rFonts w:ascii="Calibri" w:cs="Calibri" w:eastAsia="Calibri" w:hAnsi="Calibri"/>
+          <w:b/>
+          <w:bCs/>
+          <w:color w:val="2E7D4F"/>
+          <w:sz w:val="21"/>
+          <w:szCs w:val="21"/>
+        </w:rPr>
+        <w:t xml:space="preserve">Experiencia de usuario: </w:t>
+      </w:r>
+      <w:r>
+        <w:rPr>
+          <w:rFonts w:ascii="Calibri" w:cs="Calibri" w:eastAsia="Calibri" w:hAnsi="Calibri"/>
+          <w:sz w:val="21"/>
+          <w:szCs w:val="21"/>
+        </w:rPr>
+        <w:t xml:space="preserve">Sobre las pantallas ya existentes se sumaron, además, mejoras puntuales de usabilidad: en TokenDeConfirmacion, un filtro de documento (DocumentFilter) restringe cada casilla del código a un único dígito numérico y mueve el foco automáticamente entre casillas al escribir y al borrar con Backspace, para poder cargar y corregir el código sin usar el mouse; y se reemplazó el pedido de email por JOptionPane (un diálogo genérico de Swing) por PedirEmailPanel, una pantalla propia con el mismo lenguaje visual del proyecto, dimensionada como una tarjeta más chica que el resto de las pantallas del flujo por tratarse de un único campo.</w:t>
+      </w:r>
+    </w:p>
+    <w:p>
+      <w:pPr>
+        <w:pStyle w:val="Heading2"/>
+        <w:spacing w:after="120" w:before="220"/>
+      </w:pPr>
+      <w:r>
+        <w:rPr>
+          <w:rFonts w:ascii="Calibri" w:cs="Calibri" w:eastAsia="Calibri" w:hAnsi="Calibri"/>
+          <w:b/>
+          <w:bCs/>
+          <w:color w:val="2E7D4F"/>
+          <w:sz w:val="24"/>
+          <w:szCs w:val="24"/>
+        </w:rPr>
+        <w:t xml:space="preserve">9.4 Verificación de arquitectura MVC y diseño orientado a objetos</w:t>
+      </w:r>
+    </w:p>
+    <w:p>
+      <w:pPr>
+        <w:spacing w:after="160" w:line="288"/>
+      </w:pPr>
+      <w:r>
+        <w:rPr>
+          <w:rFonts w:ascii="Calibri" w:cs="Calibri" w:eastAsia="Calibri" w:hAnsi="Calibri"/>
+          <w:sz w:val="21"/>
+          <w:szCs w:val="21"/>
+        </w:rPr>
+        <w:t xml:space="preserve">La incorporación de este flujo se ajustó al mismo criterio de capas definido en la sección 6: las clases de vistas no ejecutan SQL ni lógica de negocio directamente, sino que delegan cada acción a controlador.PasswordController mediante interfaces de escucha (patrón Observer), que a su vez llama a dao.PasswordResetDAO y a conexiones.Usuario para el acceso a datos. PasswordHasher, PasswordController y EmailService se implementaron como clases utilitarias (final, con constructor privado) sin estado mutable expuesto, cada una con una única responsabilidad: hashing, orquestación del caso de uso, y envío de correo, respectivamente.</w:t>
+      </w:r>
+    </w:p>
+    <w:p>
+      <w:pPr>
+        <w:spacing w:after="160" w:line="288"/>
+      </w:pPr>
+      <w:r>
+        <w:rPr>
+          <w:rFonts w:ascii="Calibri" w:cs="Calibri" w:eastAsia="Calibri" w:hAnsi="Calibri"/>
+          <w:b/>
+          <w:bCs/>
+          <w:color w:val="B00020"/>
+          <w:sz w:val="21"/>
+          <w:szCs w:val="21"/>
+        </w:rPr>
+        <w:t xml:space="preserve">Observación: </w:t>
+      </w:r>
+      <w:r>
+        <w:rPr>
+          <w:rFonts w:ascii="Calibri" w:cs="Calibri" w:eastAsia="Calibri" w:hAnsi="Calibri"/>
+          <w:sz w:val="21"/>
+          <w:szCs w:val="21"/>
+        </w:rPr>
+        <w:t xml:space="preserve">PasswordResetDAO.Token — el objeto que representa un código pendiente de verificar — quedó definido como clase anidada dentro del propio DAO en lugar de sumarse al paquete modelo junto a Paciente.java. Al ser un dato interno que no cruza hacia la vista no genera un problema de diseño, pero para mantener la convención iniciada en la sección 6 se podría migrar a modelo en una próxima iteración.</w:t>
+      </w:r>
+    </w:p>
+    <w:p>
+      <w:pPr>
+        <w:pStyle w:val="Heading1"/>
+        <w:pBdr>
+          <w:bottom w:val="single" w:color="2E7D4F" w:sz="8" w:space="4"/>
+        </w:pBdr>
+        <w:spacing w:after="160" w:before="360"/>
+      </w:pPr>
+      <w:r>
+        <w:rPr>
+          <w:rFonts w:ascii="Calibri" w:cs="Calibri" w:eastAsia="Calibri" w:hAnsi="Calibri"/>
+          <w:b/>
+          <w:bCs/>
+          <w:color w:val="1F4E3D"/>
+          <w:sz w:val="30"/>
+          <w:szCs w:val="30"/>
+        </w:rPr>
+        <w:t xml:space="preserve">10. Próximos pasos actualizados</w:t>
+      </w:r>
+    </w:p>
+    <w:p>
+      <w:pPr>
+        <w:pStyle w:val="ListParagraph"/>
+        <w:numPr>
+          <w:ilvl w:val="0"/>
+          <w:numId w:val="2"/>
+        </w:numPr>
+        <w:spacing w:after="90" w:line="276"/>
+      </w:pPr>
+      <w:r>
+        <w:rPr>
+          <w:rFonts w:ascii="Calibri" w:cs="Calibri" w:eastAsia="Calibri" w:hAnsi="Calibri"/>
+          <w:sz w:val="21"/>
+          <w:szCs w:val="21"/>
+        </w:rPr>
+        <w:t xml:space="preserve">Agregar la librería JavaMail (com.sun.mail:javax.mail:1.6.2) a las librerías del proyecto en NetBeans y completar email.properties en cada entorno de desarrollo: sin esa librería el proyecto no compila (EmailService y PasswordController dependen de javax.mail).</w:t>
+      </w:r>
+    </w:p>
+    <w:p>
+      <w:pPr>
+        <w:pStyle w:val="ListParagraph"/>
+        <w:numPr>
+          <w:ilvl w:val="0"/>
+          <w:numId w:val="2"/>
+        </w:numPr>
+        <w:spacing w:after="90" w:line="276"/>
+      </w:pPr>
+      <w:r>
+        <w:rPr>
+          <w:rFonts w:ascii="Calibri" w:cs="Calibri" w:eastAsia="Calibri" w:hAnsi="Calibri"/>
+          <w:sz w:val="21"/>
+          <w:szCs w:val="21"/>
+        </w:rPr>
+        <w:t xml:space="preserve">Ejecutar sql/migracion_06_password_reset.sql contra la base antes de probar el flujo de recuperación de contraseña.</w:t>
+      </w:r>
+    </w:p>
+    <w:p>
+      <w:pPr>
+        <w:pStyle w:val="ListParagraph"/>
+        <w:numPr>
+          <w:ilvl w:val="0"/>
+          <w:numId w:val="2"/>
+        </w:numPr>
+        <w:spacing w:after="90" w:line="276"/>
+      </w:pPr>
+      <w:r>
+        <w:rPr>
+          <w:rFonts w:ascii="Calibri" w:cs="Calibri" w:eastAsia="Calibri" w:hAnsi="Calibri"/>
+          <w:sz w:val="21"/>
+          <w:szCs w:val="21"/>
+        </w:rPr>
+        <w:t xml:space="preserve">Migrar PasswordResetDAO.Token al paquete modelo, por consistencia con Paciente.java.</w:t>
+      </w:r>
+    </w:p>
+    <w:p>
+      <w:pPr>
+        <w:pStyle w:val="ListParagraph"/>
+        <w:numPr>
+          <w:ilvl w:val="0"/>
+          <w:numId w:val="2"/>
+        </w:numPr>
+        <w:spacing w:after="90" w:line="276"/>
+      </w:pPr>
+      <w:r>
+        <w:rPr>
+          <w:rFonts w:ascii="Calibri" w:cs="Calibri" w:eastAsia="Calibri" w:hAnsi="Calibri"/>
+          <w:sz w:val="21"/>
+          <w:szCs w:val="21"/>
+        </w:rPr>
+        <w:t xml:space="preserve">Replicar el mismo patrón (modelo + DAO) para Registros, NuevoAnalisis y RegistrarResultados, que siguen siendo interfaz sin datos.</w:t>
+      </w:r>
+    </w:p>
+    <w:p>
+      <w:pPr>
+        <w:pStyle w:val="ListParagraph"/>
+        <w:numPr>
+          <w:ilvl w:val="0"/>
+          <w:numId w:val="2"/>
+        </w:numPr>
+        <w:spacing w:after="90" w:line="276"/>
+      </w:pPr>
+      <w:r>
+        <w:rPr>
+          <w:rFonts w:ascii="Calibri" w:cs="Calibri" w:eastAsia="Calibri" w:hAnsi="Calibri"/>
+          <w:sz w:val="21"/>
+          <w:szCs w:val="21"/>
+        </w:rPr>
+        <w:t xml:space="preserve">Crear ObraSocialDAO y PedidoDAO para completar las columnas "Obra Social" y "Ultimo Examen" en TablaPacientes.</w:t>
+      </w:r>
+    </w:p>
+    <w:p>
+      <w:pPr>
+        <w:pStyle w:val="Heading1"/>
+        <w:pBdr>
+          <w:bottom w:val="single" w:color="2E7D4F" w:sz="8" w:space="4"/>
+        </w:pBdr>
+        <w:spacing w:after="160" w:before="360"/>
+      </w:pPr>
+      <w:r>
+        <w:rPr>
+          <w:rFonts w:ascii="Calibri" w:cs="Calibri" w:eastAsia="Calibri" w:hAnsi="Calibri"/>
+          <w:b/>
+          <w:bCs/>
+          <w:color w:val="1F4E3D"/>
+          <w:sz w:val="30"/>
+          <w:szCs w:val="30"/>
+        </w:rPr>
+        <w:t xml:space="preserve">11. Conclusión de esta actualización</w:t>
+      </w:r>
+    </w:p>
+    <w:p>
+      <w:pPr>
+        <w:spacing w:after="160" w:line="288"/>
+      </w:pPr>
+      <w:r>
+        <w:rPr>
+          <w:rFonts w:ascii="Calibri" w:cs="Calibri" w:eastAsia="Calibri" w:hAnsi="Calibri"/>
+          <w:sz w:val="21"/>
+          <w:szCs w:val="21"/>
+        </w:rPr>
+        <w:t xml:space="preserve">Con estos cambios, el proyecto cierra dos de las brechas señaladas en la revisión inicial: la ausencia de hashing de contraseñas y el hecho de que dos pantallas de vistas quedaran sin conectar. El criterio de capas (vista / controlador y utilitarias / dao) se mantuvo consistente con el ya aplicado al módulo de Pacientes, y la interfaz ganó, en las pantallas involucradas, un comportamiento más cercano al de una aplicación terminada: ajuste de pantalla, validación de campos y navegación por teclado.</w:t>
       </w:r>
     </w:p>
     <w:sectPr>

</xml_diff>